<commit_message>
Update Button Masher Game Reflections.docx
</commit_message>
<xml_diff>
--- a/docpac_030309/Button Masher Game/Button Masher Game Reflections.docx
+++ b/docpac_030309/Button Masher Game/Button Masher Game Reflections.docx
@@ -15,8 +15,6 @@
     <w:p>
       <w:pPr>
         <w:pStyle w:val="Heading1"/>
-        <w:keepNext/>
-        <w:keepLines/>
       </w:pPr>
       <w:r>
         <w:t>Step Reflections</w:t>
@@ -263,7 +261,6 @@
           </w:tcPr>
           <w:p>
             <w:pPr>
-              <w:keepNext w:val="0"/>
               <w:keepLines/>
               <w:spacing w:after="0"/>
               <w:rPr>
@@ -516,7 +513,6 @@
           </w:tcPr>
           <w:p>
             <w:pPr>
-              <w:keepNext w:val="0"/>
               <w:keepLines/>
               <w:spacing w:after="0"/>
               <w:rPr>
@@ -769,7 +765,6 @@
           </w:tcPr>
           <w:p>
             <w:pPr>
-              <w:keepNext w:val="0"/>
               <w:keepLines/>
               <w:spacing w:after="0"/>
               <w:rPr>
@@ -1022,766 +1017,6 @@
           </w:tcPr>
           <w:p>
             <w:pPr>
-              <w:keepNext w:val="0"/>
-              <w:keepLines/>
-              <w:spacing w:after="0"/>
-              <w:rPr>
-                <w:sz w:val="16"/>
-                <w:szCs w:val="16"/>
-              </w:rPr>
-            </w:pPr>
-          </w:p>
-        </w:tc>
-      </w:tr>
-    </w:tbl>
-    <w:p>
-      <w:pPr>
-        <w:keepNext/>
-        <w:keepLines/>
-        <w:spacing w:before="240"/>
-        <w:rPr>
-          <w:b/>
-        </w:rPr>
-      </w:pPr>
-      <w:r>
-        <w:rPr>
-          <w:b/>
-        </w:rPr>
-        <w:t>Why should the timer stop at zero rather than continuing into negative numbers?</w:t>
-      </w:r>
-    </w:p>
-    <w:tbl>
-      <w:tblPr>
-        <w:tblW w:w="5000" w:type="pct"/>
-        <w:tblBorders>
-          <w:top w:val="single" w:sz="4" w:space="0" w:color="BFBFBF"/>
-          <w:left w:val="single" w:sz="4" w:space="0" w:color="BFBFBF"/>
-          <w:bottom w:val="single" w:sz="4" w:space="0" w:color="BFBFBF"/>
-          <w:right w:val="single" w:sz="4" w:space="0" w:color="BFBFBF"/>
-          <w:insideH w:val="single" w:sz="4" w:space="0" w:color="BFBFBF"/>
-          <w:insideV w:val="single" w:sz="4" w:space="0" w:color="BFBFBF"/>
-        </w:tblBorders>
-        <w:tblLook w:val="04A0" w:firstRow="1" w:lastRow="0" w:firstColumn="1" w:lastColumn="0" w:noHBand="0" w:noVBand="1"/>
-      </w:tblPr>
-      <w:tblGrid>
-        <w:gridCol w:w="10800"/>
-      </w:tblGrid>
-      <w:tr>
-        <w:trPr>
-          <w:cantSplit/>
-        </w:trPr>
-        <w:tc>
-          <w:tcPr>
-            <w:tcW w:w="5000" w:type="pct"/>
-            <w:tcBorders>
-              <w:top w:val="single" w:sz="8" w:space="0" w:color="000000"/>
-              <w:left w:val="nil"/>
-              <w:bottom w:val="nil"/>
-              <w:right w:val="nil"/>
-            </w:tcBorders>
-          </w:tcPr>
-          <w:p>
-            <w:pPr>
-              <w:keepNext/>
-              <w:keepLines/>
-              <w:spacing w:after="0"/>
-              <w:rPr>
-                <w:sz w:val="16"/>
-                <w:szCs w:val="16"/>
-              </w:rPr>
-            </w:pPr>
-          </w:p>
-        </w:tc>
-      </w:tr>
-      <w:tr>
-        <w:trPr>
-          <w:cantSplit/>
-        </w:trPr>
-        <w:tc>
-          <w:tcPr>
-            <w:tcW w:w="5000" w:type="pct"/>
-            <w:tcBorders>
-              <w:top w:val="nil"/>
-              <w:left w:val="nil"/>
-              <w:bottom w:val="single" w:sz="8" w:space="0" w:color="000000"/>
-              <w:right w:val="nil"/>
-            </w:tcBorders>
-            <w:shd w:val="clear" w:color="auto" w:fill="D9D9D9" w:themeFill="background1" w:themeFillShade="D9"/>
-          </w:tcPr>
-          <w:p>
-            <w:pPr>
-              <w:keepNext/>
-              <w:keepLines/>
-              <w:spacing w:after="0"/>
-              <w:rPr>
-                <w:sz w:val="16"/>
-                <w:szCs w:val="16"/>
-              </w:rPr>
-            </w:pPr>
-          </w:p>
-        </w:tc>
-      </w:tr>
-      <w:tr>
-        <w:trPr>
-          <w:cantSplit/>
-        </w:trPr>
-        <w:tc>
-          <w:tcPr>
-            <w:tcW w:w="5000" w:type="pct"/>
-            <w:tcBorders>
-              <w:top w:val="single" w:sz="8" w:space="0" w:color="000000"/>
-              <w:left w:val="nil"/>
-              <w:bottom w:val="nil"/>
-              <w:right w:val="nil"/>
-            </w:tcBorders>
-          </w:tcPr>
-          <w:p>
-            <w:pPr>
-              <w:keepNext/>
-              <w:keepLines/>
-              <w:spacing w:after="0"/>
-              <w:rPr>
-                <w:sz w:val="16"/>
-                <w:szCs w:val="16"/>
-              </w:rPr>
-            </w:pPr>
-          </w:p>
-        </w:tc>
-      </w:tr>
-      <w:tr>
-        <w:trPr>
-          <w:cantSplit/>
-        </w:trPr>
-        <w:tc>
-          <w:tcPr>
-            <w:tcW w:w="5000" w:type="pct"/>
-            <w:tcBorders>
-              <w:top w:val="nil"/>
-              <w:left w:val="nil"/>
-              <w:bottom w:val="single" w:sz="8" w:space="0" w:color="000000"/>
-              <w:right w:val="nil"/>
-            </w:tcBorders>
-            <w:shd w:val="clear" w:color="auto" w:fill="D9D9D9" w:themeFill="background1" w:themeFillShade="D9"/>
-          </w:tcPr>
-          <w:p>
-            <w:pPr>
-              <w:keepNext/>
-              <w:keepLines/>
-              <w:spacing w:after="0"/>
-              <w:rPr>
-                <w:sz w:val="16"/>
-                <w:szCs w:val="16"/>
-              </w:rPr>
-            </w:pPr>
-          </w:p>
-        </w:tc>
-      </w:tr>
-      <w:tr>
-        <w:trPr>
-          <w:cantSplit/>
-        </w:trPr>
-        <w:tc>
-          <w:tcPr>
-            <w:tcW w:w="5000" w:type="pct"/>
-            <w:tcBorders>
-              <w:top w:val="single" w:sz="8" w:space="0" w:color="000000"/>
-              <w:left w:val="nil"/>
-              <w:bottom w:val="nil"/>
-              <w:right w:val="nil"/>
-            </w:tcBorders>
-          </w:tcPr>
-          <w:p>
-            <w:pPr>
-              <w:keepNext/>
-              <w:keepLines/>
-              <w:spacing w:after="0"/>
-              <w:rPr>
-                <w:sz w:val="16"/>
-                <w:szCs w:val="16"/>
-              </w:rPr>
-            </w:pPr>
-          </w:p>
-        </w:tc>
-      </w:tr>
-      <w:tr>
-        <w:trPr>
-          <w:cantSplit/>
-        </w:trPr>
-        <w:tc>
-          <w:tcPr>
-            <w:tcW w:w="5000" w:type="pct"/>
-            <w:tcBorders>
-              <w:top w:val="nil"/>
-              <w:left w:val="nil"/>
-              <w:bottom w:val="single" w:sz="8" w:space="0" w:color="000000"/>
-              <w:right w:val="nil"/>
-            </w:tcBorders>
-            <w:shd w:val="clear" w:color="auto" w:fill="D9D9D9" w:themeFill="background1" w:themeFillShade="D9"/>
-          </w:tcPr>
-          <w:p>
-            <w:pPr>
-              <w:keepNext/>
-              <w:keepLines/>
-              <w:spacing w:after="0"/>
-              <w:rPr>
-                <w:sz w:val="16"/>
-                <w:szCs w:val="16"/>
-              </w:rPr>
-            </w:pPr>
-          </w:p>
-        </w:tc>
-      </w:tr>
-      <w:tr>
-        <w:trPr>
-          <w:cantSplit/>
-        </w:trPr>
-        <w:tc>
-          <w:tcPr>
-            <w:tcW w:w="5000" w:type="pct"/>
-            <w:tcBorders>
-              <w:top w:val="single" w:sz="8" w:space="0" w:color="000000"/>
-              <w:left w:val="nil"/>
-              <w:bottom w:val="nil"/>
-              <w:right w:val="nil"/>
-            </w:tcBorders>
-          </w:tcPr>
-          <w:p>
-            <w:pPr>
-              <w:keepNext/>
-              <w:keepLines/>
-              <w:spacing w:after="0"/>
-              <w:rPr>
-                <w:sz w:val="16"/>
-                <w:szCs w:val="16"/>
-              </w:rPr>
-            </w:pPr>
-          </w:p>
-        </w:tc>
-      </w:tr>
-      <w:tr>
-        <w:trPr>
-          <w:cantSplit/>
-        </w:trPr>
-        <w:tc>
-          <w:tcPr>
-            <w:tcW w:w="5000" w:type="pct"/>
-            <w:tcBorders>
-              <w:top w:val="nil"/>
-              <w:left w:val="nil"/>
-              <w:bottom w:val="single" w:sz="8" w:space="0" w:color="000000"/>
-              <w:right w:val="nil"/>
-            </w:tcBorders>
-            <w:shd w:val="clear" w:color="auto" w:fill="D9D9D9" w:themeFill="background1" w:themeFillShade="D9"/>
-          </w:tcPr>
-          <w:p>
-            <w:pPr>
-              <w:keepNext w:val="0"/>
-              <w:keepLines/>
-              <w:spacing w:after="0"/>
-              <w:rPr>
-                <w:sz w:val="16"/>
-                <w:szCs w:val="16"/>
-              </w:rPr>
-            </w:pPr>
-          </w:p>
-        </w:tc>
-      </w:tr>
-    </w:tbl>
-    <w:p>
-      <w:pPr>
-        <w:keepNext/>
-        <w:keepLines/>
-        <w:spacing w:before="240"/>
-        <w:rPr>
-          <w:b/>
-        </w:rPr>
-      </w:pPr>
-      <w:r>
-        <w:rPr>
-          <w:b/>
-        </w:rPr>
-        <w:t>How does the direction box communicate the condition the player must satisfy before a button press can score?</w:t>
-      </w:r>
-    </w:p>
-    <w:tbl>
-      <w:tblPr>
-        <w:tblW w:w="5000" w:type="pct"/>
-        <w:tblBorders>
-          <w:top w:val="single" w:sz="4" w:space="0" w:color="BFBFBF"/>
-          <w:left w:val="single" w:sz="4" w:space="0" w:color="BFBFBF"/>
-          <w:bottom w:val="single" w:sz="4" w:space="0" w:color="BFBFBF"/>
-          <w:right w:val="single" w:sz="4" w:space="0" w:color="BFBFBF"/>
-          <w:insideH w:val="single" w:sz="4" w:space="0" w:color="BFBFBF"/>
-          <w:insideV w:val="single" w:sz="4" w:space="0" w:color="BFBFBF"/>
-        </w:tblBorders>
-        <w:tblLook w:val="04A0" w:firstRow="1" w:lastRow="0" w:firstColumn="1" w:lastColumn="0" w:noHBand="0" w:noVBand="1"/>
-      </w:tblPr>
-      <w:tblGrid>
-        <w:gridCol w:w="10800"/>
-      </w:tblGrid>
-      <w:tr>
-        <w:trPr>
-          <w:cantSplit/>
-        </w:trPr>
-        <w:tc>
-          <w:tcPr>
-            <w:tcW w:w="5000" w:type="pct"/>
-            <w:tcBorders>
-              <w:top w:val="single" w:sz="8" w:space="0" w:color="000000"/>
-              <w:left w:val="nil"/>
-              <w:bottom w:val="nil"/>
-              <w:right w:val="nil"/>
-            </w:tcBorders>
-          </w:tcPr>
-          <w:p>
-            <w:pPr>
-              <w:keepNext/>
-              <w:keepLines/>
-              <w:spacing w:after="0"/>
-              <w:rPr>
-                <w:sz w:val="16"/>
-                <w:szCs w:val="16"/>
-              </w:rPr>
-            </w:pPr>
-          </w:p>
-        </w:tc>
-      </w:tr>
-      <w:tr>
-        <w:trPr>
-          <w:cantSplit/>
-        </w:trPr>
-        <w:tc>
-          <w:tcPr>
-            <w:tcW w:w="5000" w:type="pct"/>
-            <w:tcBorders>
-              <w:top w:val="nil"/>
-              <w:left w:val="nil"/>
-              <w:bottom w:val="single" w:sz="8" w:space="0" w:color="000000"/>
-              <w:right w:val="nil"/>
-            </w:tcBorders>
-            <w:shd w:val="clear" w:color="auto" w:fill="D9D9D9" w:themeFill="background1" w:themeFillShade="D9"/>
-          </w:tcPr>
-          <w:p>
-            <w:pPr>
-              <w:keepNext/>
-              <w:keepLines/>
-              <w:spacing w:after="0"/>
-              <w:rPr>
-                <w:sz w:val="16"/>
-                <w:szCs w:val="16"/>
-              </w:rPr>
-            </w:pPr>
-          </w:p>
-        </w:tc>
-      </w:tr>
-      <w:tr>
-        <w:trPr>
-          <w:cantSplit/>
-        </w:trPr>
-        <w:tc>
-          <w:tcPr>
-            <w:tcW w:w="5000" w:type="pct"/>
-            <w:tcBorders>
-              <w:top w:val="single" w:sz="8" w:space="0" w:color="000000"/>
-              <w:left w:val="nil"/>
-              <w:bottom w:val="nil"/>
-              <w:right w:val="nil"/>
-            </w:tcBorders>
-          </w:tcPr>
-          <w:p>
-            <w:pPr>
-              <w:keepNext/>
-              <w:keepLines/>
-              <w:spacing w:after="0"/>
-              <w:rPr>
-                <w:sz w:val="16"/>
-                <w:szCs w:val="16"/>
-              </w:rPr>
-            </w:pPr>
-          </w:p>
-        </w:tc>
-      </w:tr>
-      <w:tr>
-        <w:trPr>
-          <w:cantSplit/>
-        </w:trPr>
-        <w:tc>
-          <w:tcPr>
-            <w:tcW w:w="5000" w:type="pct"/>
-            <w:tcBorders>
-              <w:top w:val="nil"/>
-              <w:left w:val="nil"/>
-              <w:bottom w:val="single" w:sz="8" w:space="0" w:color="000000"/>
-              <w:right w:val="nil"/>
-            </w:tcBorders>
-            <w:shd w:val="clear" w:color="auto" w:fill="D9D9D9" w:themeFill="background1" w:themeFillShade="D9"/>
-          </w:tcPr>
-          <w:p>
-            <w:pPr>
-              <w:keepNext/>
-              <w:keepLines/>
-              <w:spacing w:after="0"/>
-              <w:rPr>
-                <w:sz w:val="16"/>
-                <w:szCs w:val="16"/>
-              </w:rPr>
-            </w:pPr>
-          </w:p>
-        </w:tc>
-      </w:tr>
-      <w:tr>
-        <w:trPr>
-          <w:cantSplit/>
-        </w:trPr>
-        <w:tc>
-          <w:tcPr>
-            <w:tcW w:w="5000" w:type="pct"/>
-            <w:tcBorders>
-              <w:top w:val="single" w:sz="8" w:space="0" w:color="000000"/>
-              <w:left w:val="nil"/>
-              <w:bottom w:val="nil"/>
-              <w:right w:val="nil"/>
-            </w:tcBorders>
-          </w:tcPr>
-          <w:p>
-            <w:pPr>
-              <w:keepNext/>
-              <w:keepLines/>
-              <w:spacing w:after="0"/>
-              <w:rPr>
-                <w:sz w:val="16"/>
-                <w:szCs w:val="16"/>
-              </w:rPr>
-            </w:pPr>
-          </w:p>
-        </w:tc>
-      </w:tr>
-      <w:tr>
-        <w:trPr>
-          <w:cantSplit/>
-        </w:trPr>
-        <w:tc>
-          <w:tcPr>
-            <w:tcW w:w="5000" w:type="pct"/>
-            <w:tcBorders>
-              <w:top w:val="nil"/>
-              <w:left w:val="nil"/>
-              <w:bottom w:val="single" w:sz="8" w:space="0" w:color="000000"/>
-              <w:right w:val="nil"/>
-            </w:tcBorders>
-            <w:shd w:val="clear" w:color="auto" w:fill="D9D9D9" w:themeFill="background1" w:themeFillShade="D9"/>
-          </w:tcPr>
-          <w:p>
-            <w:pPr>
-              <w:keepNext/>
-              <w:keepLines/>
-              <w:spacing w:after="0"/>
-              <w:rPr>
-                <w:sz w:val="16"/>
-                <w:szCs w:val="16"/>
-              </w:rPr>
-            </w:pPr>
-          </w:p>
-        </w:tc>
-      </w:tr>
-      <w:tr>
-        <w:trPr>
-          <w:cantSplit/>
-        </w:trPr>
-        <w:tc>
-          <w:tcPr>
-            <w:tcW w:w="5000" w:type="pct"/>
-            <w:tcBorders>
-              <w:top w:val="single" w:sz="8" w:space="0" w:color="000000"/>
-              <w:left w:val="nil"/>
-              <w:bottom w:val="nil"/>
-              <w:right w:val="nil"/>
-            </w:tcBorders>
-          </w:tcPr>
-          <w:p>
-            <w:pPr>
-              <w:keepNext/>
-              <w:keepLines/>
-              <w:spacing w:after="0"/>
-              <w:rPr>
-                <w:sz w:val="16"/>
-                <w:szCs w:val="16"/>
-              </w:rPr>
-            </w:pPr>
-          </w:p>
-        </w:tc>
-      </w:tr>
-      <w:tr>
-        <w:trPr>
-          <w:cantSplit/>
-        </w:trPr>
-        <w:tc>
-          <w:tcPr>
-            <w:tcW w:w="5000" w:type="pct"/>
-            <w:tcBorders>
-              <w:top w:val="nil"/>
-              <w:left w:val="nil"/>
-              <w:bottom w:val="single" w:sz="8" w:space="0" w:color="000000"/>
-              <w:right w:val="nil"/>
-            </w:tcBorders>
-            <w:shd w:val="clear" w:color="auto" w:fill="D9D9D9" w:themeFill="background1" w:themeFillShade="D9"/>
-          </w:tcPr>
-          <w:p>
-            <w:pPr>
-              <w:keepNext w:val="0"/>
-              <w:keepLines/>
-              <w:spacing w:after="0"/>
-              <w:rPr>
-                <w:sz w:val="16"/>
-                <w:szCs w:val="16"/>
-              </w:rPr>
-            </w:pPr>
-          </w:p>
-        </w:tc>
-      </w:tr>
-    </w:tbl>
-    <w:p>
-      <w:pPr>
-        <w:keepNext/>
-        <w:keepLines/>
-        <w:spacing w:before="240"/>
-        <w:rPr>
-          <w:b/>
-        </w:rPr>
-      </w:pPr>
-      <w:r>
-        <w:rPr>
-          <w:b/>
-        </w:rPr>
-        <w:t>Why is a controller-status message more helpful than allowing the game to appear broken when no gamepad is detected?</w:t>
-      </w:r>
-    </w:p>
-    <w:tbl>
-      <w:tblPr>
-        <w:tblW w:w="5000" w:type="pct"/>
-        <w:tblBorders>
-          <w:top w:val="single" w:sz="4" w:space="0" w:color="BFBFBF"/>
-          <w:left w:val="single" w:sz="4" w:space="0" w:color="BFBFBF"/>
-          <w:bottom w:val="single" w:sz="4" w:space="0" w:color="BFBFBF"/>
-          <w:right w:val="single" w:sz="4" w:space="0" w:color="BFBFBF"/>
-          <w:insideH w:val="single" w:sz="4" w:space="0" w:color="BFBFBF"/>
-          <w:insideV w:val="single" w:sz="4" w:space="0" w:color="BFBFBF"/>
-        </w:tblBorders>
-        <w:tblLook w:val="04A0" w:firstRow="1" w:lastRow="0" w:firstColumn="1" w:lastColumn="0" w:noHBand="0" w:noVBand="1"/>
-      </w:tblPr>
-      <w:tblGrid>
-        <w:gridCol w:w="10800"/>
-      </w:tblGrid>
-      <w:tr>
-        <w:trPr>
-          <w:cantSplit/>
-        </w:trPr>
-        <w:tc>
-          <w:tcPr>
-            <w:tcW w:w="5000" w:type="pct"/>
-            <w:tcBorders>
-              <w:top w:val="single" w:sz="8" w:space="0" w:color="000000"/>
-              <w:left w:val="nil"/>
-              <w:bottom w:val="nil"/>
-              <w:right w:val="nil"/>
-            </w:tcBorders>
-          </w:tcPr>
-          <w:p>
-            <w:pPr>
-              <w:keepNext/>
-              <w:keepLines/>
-              <w:spacing w:after="0"/>
-              <w:rPr>
-                <w:sz w:val="16"/>
-                <w:szCs w:val="16"/>
-              </w:rPr>
-            </w:pPr>
-          </w:p>
-        </w:tc>
-      </w:tr>
-      <w:tr>
-        <w:trPr>
-          <w:cantSplit/>
-        </w:trPr>
-        <w:tc>
-          <w:tcPr>
-            <w:tcW w:w="5000" w:type="pct"/>
-            <w:tcBorders>
-              <w:top w:val="nil"/>
-              <w:left w:val="nil"/>
-              <w:bottom w:val="single" w:sz="8" w:space="0" w:color="000000"/>
-              <w:right w:val="nil"/>
-            </w:tcBorders>
-            <w:shd w:val="clear" w:color="auto" w:fill="D9D9D9" w:themeFill="background1" w:themeFillShade="D9"/>
-          </w:tcPr>
-          <w:p>
-            <w:pPr>
-              <w:keepNext/>
-              <w:keepLines/>
-              <w:spacing w:after="0"/>
-              <w:rPr>
-                <w:sz w:val="16"/>
-                <w:szCs w:val="16"/>
-              </w:rPr>
-            </w:pPr>
-          </w:p>
-        </w:tc>
-      </w:tr>
-      <w:tr>
-        <w:trPr>
-          <w:cantSplit/>
-        </w:trPr>
-        <w:tc>
-          <w:tcPr>
-            <w:tcW w:w="5000" w:type="pct"/>
-            <w:tcBorders>
-              <w:top w:val="single" w:sz="8" w:space="0" w:color="000000"/>
-              <w:left w:val="nil"/>
-              <w:bottom w:val="nil"/>
-              <w:right w:val="nil"/>
-            </w:tcBorders>
-          </w:tcPr>
-          <w:p>
-            <w:pPr>
-              <w:keepNext/>
-              <w:keepLines/>
-              <w:spacing w:after="0"/>
-              <w:rPr>
-                <w:sz w:val="16"/>
-                <w:szCs w:val="16"/>
-              </w:rPr>
-            </w:pPr>
-          </w:p>
-        </w:tc>
-      </w:tr>
-      <w:tr>
-        <w:trPr>
-          <w:cantSplit/>
-        </w:trPr>
-        <w:tc>
-          <w:tcPr>
-            <w:tcW w:w="5000" w:type="pct"/>
-            <w:tcBorders>
-              <w:top w:val="nil"/>
-              <w:left w:val="nil"/>
-              <w:bottom w:val="single" w:sz="8" w:space="0" w:color="000000"/>
-              <w:right w:val="nil"/>
-            </w:tcBorders>
-            <w:shd w:val="clear" w:color="auto" w:fill="D9D9D9" w:themeFill="background1" w:themeFillShade="D9"/>
-          </w:tcPr>
-          <w:p>
-            <w:pPr>
-              <w:keepNext/>
-              <w:keepLines/>
-              <w:spacing w:after="0"/>
-              <w:rPr>
-                <w:sz w:val="16"/>
-                <w:szCs w:val="16"/>
-              </w:rPr>
-            </w:pPr>
-          </w:p>
-        </w:tc>
-      </w:tr>
-      <w:tr>
-        <w:trPr>
-          <w:cantSplit/>
-        </w:trPr>
-        <w:tc>
-          <w:tcPr>
-            <w:tcW w:w="5000" w:type="pct"/>
-            <w:tcBorders>
-              <w:top w:val="single" w:sz="8" w:space="0" w:color="000000"/>
-              <w:left w:val="nil"/>
-              <w:bottom w:val="nil"/>
-              <w:right w:val="nil"/>
-            </w:tcBorders>
-          </w:tcPr>
-          <w:p>
-            <w:pPr>
-              <w:keepNext/>
-              <w:keepLines/>
-              <w:spacing w:after="0"/>
-              <w:rPr>
-                <w:sz w:val="16"/>
-                <w:szCs w:val="16"/>
-              </w:rPr>
-            </w:pPr>
-          </w:p>
-        </w:tc>
-      </w:tr>
-      <w:tr>
-        <w:trPr>
-          <w:cantSplit/>
-        </w:trPr>
-        <w:tc>
-          <w:tcPr>
-            <w:tcW w:w="5000" w:type="pct"/>
-            <w:tcBorders>
-              <w:top w:val="nil"/>
-              <w:left w:val="nil"/>
-              <w:bottom w:val="single" w:sz="8" w:space="0" w:color="000000"/>
-              <w:right w:val="nil"/>
-            </w:tcBorders>
-            <w:shd w:val="clear" w:color="auto" w:fill="D9D9D9" w:themeFill="background1" w:themeFillShade="D9"/>
-          </w:tcPr>
-          <w:p>
-            <w:pPr>
-              <w:keepNext/>
-              <w:keepLines/>
-              <w:spacing w:after="0"/>
-              <w:rPr>
-                <w:sz w:val="16"/>
-                <w:szCs w:val="16"/>
-              </w:rPr>
-            </w:pPr>
-          </w:p>
-        </w:tc>
-      </w:tr>
-      <w:tr>
-        <w:trPr>
-          <w:cantSplit/>
-        </w:trPr>
-        <w:tc>
-          <w:tcPr>
-            <w:tcW w:w="5000" w:type="pct"/>
-            <w:tcBorders>
-              <w:top w:val="single" w:sz="8" w:space="0" w:color="000000"/>
-              <w:left w:val="nil"/>
-              <w:bottom w:val="nil"/>
-              <w:right w:val="nil"/>
-            </w:tcBorders>
-          </w:tcPr>
-          <w:p>
-            <w:pPr>
-              <w:keepNext/>
-              <w:keepLines/>
-              <w:spacing w:after="0"/>
-              <w:rPr>
-                <w:sz w:val="16"/>
-                <w:szCs w:val="16"/>
-              </w:rPr>
-            </w:pPr>
-          </w:p>
-        </w:tc>
-      </w:tr>
-      <w:tr>
-        <w:trPr>
-          <w:cantSplit/>
-        </w:trPr>
-        <w:tc>
-          <w:tcPr>
-            <w:tcW w:w="5000" w:type="pct"/>
-            <w:tcBorders>
-              <w:top w:val="nil"/>
-              <w:left w:val="nil"/>
-              <w:bottom w:val="single" w:sz="8" w:space="0" w:color="000000"/>
-              <w:right w:val="nil"/>
-            </w:tcBorders>
-            <w:shd w:val="clear" w:color="auto" w:fill="D9D9D9" w:themeFill="background1" w:themeFillShade="D9"/>
-          </w:tcPr>
-          <w:p>
-            <w:pPr>
-              <w:keepNext w:val="0"/>
               <w:keepLines/>
               <w:spacing w:after="0"/>
               <w:rPr>
@@ -2034,7 +1269,6 @@
           </w:tcPr>
           <w:p>
             <w:pPr>
-              <w:keepNext w:val="0"/>
               <w:keepLines/>
               <w:spacing w:after="0"/>
               <w:rPr>
@@ -2059,6 +1293,7 @@
         <w:rPr>
           <w:b/>
         </w:rPr>
+        <w:lastRenderedPageBreak/>
         <w:t>Why is retrieving the display elements once preferable to repeatedly searching for them during every controller-polling frame?</w:t>
       </w:r>
     </w:p>
@@ -2287,7 +1522,6 @@
           </w:tcPr>
           <w:p>
             <w:pPr>
-              <w:keepNext w:val="0"/>
               <w:keepLines/>
               <w:spacing w:after="0"/>
               <w:rPr>
@@ -2540,766 +1774,6 @@
           </w:tcPr>
           <w:p>
             <w:pPr>
-              <w:keepNext w:val="0"/>
-              <w:keepLines/>
-              <w:spacing w:after="0"/>
-              <w:rPr>
-                <w:sz w:val="16"/>
-                <w:szCs w:val="16"/>
-              </w:rPr>
-            </w:pPr>
-          </w:p>
-        </w:tc>
-      </w:tr>
-    </w:tbl>
-    <w:p>
-      <w:pPr>
-        <w:keepNext/>
-        <w:keepLines/>
-        <w:spacing w:before="240"/>
-        <w:rPr>
-          <w:b/>
-        </w:rPr>
-      </w:pPr>
-      <w:r>
-        <w:rPr>
-          <w:b/>
-        </w:rPr>
-        <w:t>Why should the timer interval be stopped or prevented from continuing after the game ends?</w:t>
-      </w:r>
-    </w:p>
-    <w:tbl>
-      <w:tblPr>
-        <w:tblW w:w="5000" w:type="pct"/>
-        <w:tblBorders>
-          <w:top w:val="single" w:sz="4" w:space="0" w:color="BFBFBF"/>
-          <w:left w:val="single" w:sz="4" w:space="0" w:color="BFBFBF"/>
-          <w:bottom w:val="single" w:sz="4" w:space="0" w:color="BFBFBF"/>
-          <w:right w:val="single" w:sz="4" w:space="0" w:color="BFBFBF"/>
-          <w:insideH w:val="single" w:sz="4" w:space="0" w:color="BFBFBF"/>
-          <w:insideV w:val="single" w:sz="4" w:space="0" w:color="BFBFBF"/>
-        </w:tblBorders>
-        <w:tblLook w:val="04A0" w:firstRow="1" w:lastRow="0" w:firstColumn="1" w:lastColumn="0" w:noHBand="0" w:noVBand="1"/>
-      </w:tblPr>
-      <w:tblGrid>
-        <w:gridCol w:w="10800"/>
-      </w:tblGrid>
-      <w:tr>
-        <w:trPr>
-          <w:cantSplit/>
-        </w:trPr>
-        <w:tc>
-          <w:tcPr>
-            <w:tcW w:w="5000" w:type="pct"/>
-            <w:tcBorders>
-              <w:top w:val="single" w:sz="8" w:space="0" w:color="000000"/>
-              <w:left w:val="nil"/>
-              <w:bottom w:val="nil"/>
-              <w:right w:val="nil"/>
-            </w:tcBorders>
-          </w:tcPr>
-          <w:p>
-            <w:pPr>
-              <w:keepNext/>
-              <w:keepLines/>
-              <w:spacing w:after="0"/>
-              <w:rPr>
-                <w:sz w:val="16"/>
-                <w:szCs w:val="16"/>
-              </w:rPr>
-            </w:pPr>
-          </w:p>
-        </w:tc>
-      </w:tr>
-      <w:tr>
-        <w:trPr>
-          <w:cantSplit/>
-        </w:trPr>
-        <w:tc>
-          <w:tcPr>
-            <w:tcW w:w="5000" w:type="pct"/>
-            <w:tcBorders>
-              <w:top w:val="nil"/>
-              <w:left w:val="nil"/>
-              <w:bottom w:val="single" w:sz="8" w:space="0" w:color="000000"/>
-              <w:right w:val="nil"/>
-            </w:tcBorders>
-            <w:shd w:val="clear" w:color="auto" w:fill="D9D9D9" w:themeFill="background1" w:themeFillShade="D9"/>
-          </w:tcPr>
-          <w:p>
-            <w:pPr>
-              <w:keepNext/>
-              <w:keepLines/>
-              <w:spacing w:after="0"/>
-              <w:rPr>
-                <w:sz w:val="16"/>
-                <w:szCs w:val="16"/>
-              </w:rPr>
-            </w:pPr>
-          </w:p>
-        </w:tc>
-      </w:tr>
-      <w:tr>
-        <w:trPr>
-          <w:cantSplit/>
-        </w:trPr>
-        <w:tc>
-          <w:tcPr>
-            <w:tcW w:w="5000" w:type="pct"/>
-            <w:tcBorders>
-              <w:top w:val="single" w:sz="8" w:space="0" w:color="000000"/>
-              <w:left w:val="nil"/>
-              <w:bottom w:val="nil"/>
-              <w:right w:val="nil"/>
-            </w:tcBorders>
-          </w:tcPr>
-          <w:p>
-            <w:pPr>
-              <w:keepNext/>
-              <w:keepLines/>
-              <w:spacing w:after="0"/>
-              <w:rPr>
-                <w:sz w:val="16"/>
-                <w:szCs w:val="16"/>
-              </w:rPr>
-            </w:pPr>
-          </w:p>
-        </w:tc>
-      </w:tr>
-      <w:tr>
-        <w:trPr>
-          <w:cantSplit/>
-        </w:trPr>
-        <w:tc>
-          <w:tcPr>
-            <w:tcW w:w="5000" w:type="pct"/>
-            <w:tcBorders>
-              <w:top w:val="nil"/>
-              <w:left w:val="nil"/>
-              <w:bottom w:val="single" w:sz="8" w:space="0" w:color="000000"/>
-              <w:right w:val="nil"/>
-            </w:tcBorders>
-            <w:shd w:val="clear" w:color="auto" w:fill="D9D9D9" w:themeFill="background1" w:themeFillShade="D9"/>
-          </w:tcPr>
-          <w:p>
-            <w:pPr>
-              <w:keepNext/>
-              <w:keepLines/>
-              <w:spacing w:after="0"/>
-              <w:rPr>
-                <w:sz w:val="16"/>
-                <w:szCs w:val="16"/>
-              </w:rPr>
-            </w:pPr>
-          </w:p>
-        </w:tc>
-      </w:tr>
-      <w:tr>
-        <w:trPr>
-          <w:cantSplit/>
-        </w:trPr>
-        <w:tc>
-          <w:tcPr>
-            <w:tcW w:w="5000" w:type="pct"/>
-            <w:tcBorders>
-              <w:top w:val="single" w:sz="8" w:space="0" w:color="000000"/>
-              <w:left w:val="nil"/>
-              <w:bottom w:val="nil"/>
-              <w:right w:val="nil"/>
-            </w:tcBorders>
-          </w:tcPr>
-          <w:p>
-            <w:pPr>
-              <w:keepNext/>
-              <w:keepLines/>
-              <w:spacing w:after="0"/>
-              <w:rPr>
-                <w:sz w:val="16"/>
-                <w:szCs w:val="16"/>
-              </w:rPr>
-            </w:pPr>
-          </w:p>
-        </w:tc>
-      </w:tr>
-      <w:tr>
-        <w:trPr>
-          <w:cantSplit/>
-        </w:trPr>
-        <w:tc>
-          <w:tcPr>
-            <w:tcW w:w="5000" w:type="pct"/>
-            <w:tcBorders>
-              <w:top w:val="nil"/>
-              <w:left w:val="nil"/>
-              <w:bottom w:val="single" w:sz="8" w:space="0" w:color="000000"/>
-              <w:right w:val="nil"/>
-            </w:tcBorders>
-            <w:shd w:val="clear" w:color="auto" w:fill="D9D9D9" w:themeFill="background1" w:themeFillShade="D9"/>
-          </w:tcPr>
-          <w:p>
-            <w:pPr>
-              <w:keepNext/>
-              <w:keepLines/>
-              <w:spacing w:after="0"/>
-              <w:rPr>
-                <w:sz w:val="16"/>
-                <w:szCs w:val="16"/>
-              </w:rPr>
-            </w:pPr>
-          </w:p>
-        </w:tc>
-      </w:tr>
-      <w:tr>
-        <w:trPr>
-          <w:cantSplit/>
-        </w:trPr>
-        <w:tc>
-          <w:tcPr>
-            <w:tcW w:w="5000" w:type="pct"/>
-            <w:tcBorders>
-              <w:top w:val="single" w:sz="8" w:space="0" w:color="000000"/>
-              <w:left w:val="nil"/>
-              <w:bottom w:val="nil"/>
-              <w:right w:val="nil"/>
-            </w:tcBorders>
-          </w:tcPr>
-          <w:p>
-            <w:pPr>
-              <w:keepNext/>
-              <w:keepLines/>
-              <w:spacing w:after="0"/>
-              <w:rPr>
-                <w:sz w:val="16"/>
-                <w:szCs w:val="16"/>
-              </w:rPr>
-            </w:pPr>
-          </w:p>
-        </w:tc>
-      </w:tr>
-      <w:tr>
-        <w:trPr>
-          <w:cantSplit/>
-        </w:trPr>
-        <w:tc>
-          <w:tcPr>
-            <w:tcW w:w="5000" w:type="pct"/>
-            <w:tcBorders>
-              <w:top w:val="nil"/>
-              <w:left w:val="nil"/>
-              <w:bottom w:val="single" w:sz="8" w:space="0" w:color="000000"/>
-              <w:right w:val="nil"/>
-            </w:tcBorders>
-            <w:shd w:val="clear" w:color="auto" w:fill="D9D9D9" w:themeFill="background1" w:themeFillShade="D9"/>
-          </w:tcPr>
-          <w:p>
-            <w:pPr>
-              <w:keepNext w:val="0"/>
-              <w:keepLines/>
-              <w:spacing w:after="0"/>
-              <w:rPr>
-                <w:sz w:val="16"/>
-                <w:szCs w:val="16"/>
-              </w:rPr>
-            </w:pPr>
-          </w:p>
-        </w:tc>
-      </w:tr>
-    </w:tbl>
-    <w:p>
-      <w:pPr>
-        <w:keepNext/>
-        <w:keepLines/>
-        <w:spacing w:before="240"/>
-        <w:rPr>
-          <w:b/>
-        </w:rPr>
-      </w:pPr>
-      <w:r>
-        <w:rPr>
-          <w:b/>
-        </w:rPr>
-        <w:t>Why must the random calculation be designed to produce all four direction values but never produce four?</w:t>
-      </w:r>
-    </w:p>
-    <w:tbl>
-      <w:tblPr>
-        <w:tblW w:w="5000" w:type="pct"/>
-        <w:tblBorders>
-          <w:top w:val="single" w:sz="4" w:space="0" w:color="BFBFBF"/>
-          <w:left w:val="single" w:sz="4" w:space="0" w:color="BFBFBF"/>
-          <w:bottom w:val="single" w:sz="4" w:space="0" w:color="BFBFBF"/>
-          <w:right w:val="single" w:sz="4" w:space="0" w:color="BFBFBF"/>
-          <w:insideH w:val="single" w:sz="4" w:space="0" w:color="BFBFBF"/>
-          <w:insideV w:val="single" w:sz="4" w:space="0" w:color="BFBFBF"/>
-        </w:tblBorders>
-        <w:tblLook w:val="04A0" w:firstRow="1" w:lastRow="0" w:firstColumn="1" w:lastColumn="0" w:noHBand="0" w:noVBand="1"/>
-      </w:tblPr>
-      <w:tblGrid>
-        <w:gridCol w:w="10800"/>
-      </w:tblGrid>
-      <w:tr>
-        <w:trPr>
-          <w:cantSplit/>
-        </w:trPr>
-        <w:tc>
-          <w:tcPr>
-            <w:tcW w:w="5000" w:type="pct"/>
-            <w:tcBorders>
-              <w:top w:val="single" w:sz="8" w:space="0" w:color="000000"/>
-              <w:left w:val="nil"/>
-              <w:bottom w:val="nil"/>
-              <w:right w:val="nil"/>
-            </w:tcBorders>
-          </w:tcPr>
-          <w:p>
-            <w:pPr>
-              <w:keepNext/>
-              <w:keepLines/>
-              <w:spacing w:after="0"/>
-              <w:rPr>
-                <w:sz w:val="16"/>
-                <w:szCs w:val="16"/>
-              </w:rPr>
-            </w:pPr>
-          </w:p>
-        </w:tc>
-      </w:tr>
-      <w:tr>
-        <w:trPr>
-          <w:cantSplit/>
-        </w:trPr>
-        <w:tc>
-          <w:tcPr>
-            <w:tcW w:w="5000" w:type="pct"/>
-            <w:tcBorders>
-              <w:top w:val="nil"/>
-              <w:left w:val="nil"/>
-              <w:bottom w:val="single" w:sz="8" w:space="0" w:color="000000"/>
-              <w:right w:val="nil"/>
-            </w:tcBorders>
-            <w:shd w:val="clear" w:color="auto" w:fill="D9D9D9" w:themeFill="background1" w:themeFillShade="D9"/>
-          </w:tcPr>
-          <w:p>
-            <w:pPr>
-              <w:keepNext/>
-              <w:keepLines/>
-              <w:spacing w:after="0"/>
-              <w:rPr>
-                <w:sz w:val="16"/>
-                <w:szCs w:val="16"/>
-              </w:rPr>
-            </w:pPr>
-          </w:p>
-        </w:tc>
-      </w:tr>
-      <w:tr>
-        <w:trPr>
-          <w:cantSplit/>
-        </w:trPr>
-        <w:tc>
-          <w:tcPr>
-            <w:tcW w:w="5000" w:type="pct"/>
-            <w:tcBorders>
-              <w:top w:val="single" w:sz="8" w:space="0" w:color="000000"/>
-              <w:left w:val="nil"/>
-              <w:bottom w:val="nil"/>
-              <w:right w:val="nil"/>
-            </w:tcBorders>
-          </w:tcPr>
-          <w:p>
-            <w:pPr>
-              <w:keepNext/>
-              <w:keepLines/>
-              <w:spacing w:after="0"/>
-              <w:rPr>
-                <w:sz w:val="16"/>
-                <w:szCs w:val="16"/>
-              </w:rPr>
-            </w:pPr>
-          </w:p>
-        </w:tc>
-      </w:tr>
-      <w:tr>
-        <w:trPr>
-          <w:cantSplit/>
-        </w:trPr>
-        <w:tc>
-          <w:tcPr>
-            <w:tcW w:w="5000" w:type="pct"/>
-            <w:tcBorders>
-              <w:top w:val="nil"/>
-              <w:left w:val="nil"/>
-              <w:bottom w:val="single" w:sz="8" w:space="0" w:color="000000"/>
-              <w:right w:val="nil"/>
-            </w:tcBorders>
-            <w:shd w:val="clear" w:color="auto" w:fill="D9D9D9" w:themeFill="background1" w:themeFillShade="D9"/>
-          </w:tcPr>
-          <w:p>
-            <w:pPr>
-              <w:keepNext/>
-              <w:keepLines/>
-              <w:spacing w:after="0"/>
-              <w:rPr>
-                <w:sz w:val="16"/>
-                <w:szCs w:val="16"/>
-              </w:rPr>
-            </w:pPr>
-          </w:p>
-        </w:tc>
-      </w:tr>
-      <w:tr>
-        <w:trPr>
-          <w:cantSplit/>
-        </w:trPr>
-        <w:tc>
-          <w:tcPr>
-            <w:tcW w:w="5000" w:type="pct"/>
-            <w:tcBorders>
-              <w:top w:val="single" w:sz="8" w:space="0" w:color="000000"/>
-              <w:left w:val="nil"/>
-              <w:bottom w:val="nil"/>
-              <w:right w:val="nil"/>
-            </w:tcBorders>
-          </w:tcPr>
-          <w:p>
-            <w:pPr>
-              <w:keepNext/>
-              <w:keepLines/>
-              <w:spacing w:after="0"/>
-              <w:rPr>
-                <w:sz w:val="16"/>
-                <w:szCs w:val="16"/>
-              </w:rPr>
-            </w:pPr>
-          </w:p>
-        </w:tc>
-      </w:tr>
-      <w:tr>
-        <w:trPr>
-          <w:cantSplit/>
-        </w:trPr>
-        <w:tc>
-          <w:tcPr>
-            <w:tcW w:w="5000" w:type="pct"/>
-            <w:tcBorders>
-              <w:top w:val="nil"/>
-              <w:left w:val="nil"/>
-              <w:bottom w:val="single" w:sz="8" w:space="0" w:color="000000"/>
-              <w:right w:val="nil"/>
-            </w:tcBorders>
-            <w:shd w:val="clear" w:color="auto" w:fill="D9D9D9" w:themeFill="background1" w:themeFillShade="D9"/>
-          </w:tcPr>
-          <w:p>
-            <w:pPr>
-              <w:keepNext/>
-              <w:keepLines/>
-              <w:spacing w:after="0"/>
-              <w:rPr>
-                <w:sz w:val="16"/>
-                <w:szCs w:val="16"/>
-              </w:rPr>
-            </w:pPr>
-          </w:p>
-        </w:tc>
-      </w:tr>
-      <w:tr>
-        <w:trPr>
-          <w:cantSplit/>
-        </w:trPr>
-        <w:tc>
-          <w:tcPr>
-            <w:tcW w:w="5000" w:type="pct"/>
-            <w:tcBorders>
-              <w:top w:val="single" w:sz="8" w:space="0" w:color="000000"/>
-              <w:left w:val="nil"/>
-              <w:bottom w:val="nil"/>
-              <w:right w:val="nil"/>
-            </w:tcBorders>
-          </w:tcPr>
-          <w:p>
-            <w:pPr>
-              <w:keepNext/>
-              <w:keepLines/>
-              <w:spacing w:after="0"/>
-              <w:rPr>
-                <w:sz w:val="16"/>
-                <w:szCs w:val="16"/>
-              </w:rPr>
-            </w:pPr>
-          </w:p>
-        </w:tc>
-      </w:tr>
-      <w:tr>
-        <w:trPr>
-          <w:cantSplit/>
-        </w:trPr>
-        <w:tc>
-          <w:tcPr>
-            <w:tcW w:w="5000" w:type="pct"/>
-            <w:tcBorders>
-              <w:top w:val="nil"/>
-              <w:left w:val="nil"/>
-              <w:bottom w:val="single" w:sz="8" w:space="0" w:color="000000"/>
-              <w:right w:val="nil"/>
-            </w:tcBorders>
-            <w:shd w:val="clear" w:color="auto" w:fill="D9D9D9" w:themeFill="background1" w:themeFillShade="D9"/>
-          </w:tcPr>
-          <w:p>
-            <w:pPr>
-              <w:keepNext w:val="0"/>
-              <w:keepLines/>
-              <w:spacing w:after="0"/>
-              <w:rPr>
-                <w:sz w:val="16"/>
-                <w:szCs w:val="16"/>
-              </w:rPr>
-            </w:pPr>
-          </w:p>
-        </w:tc>
-      </w:tr>
-    </w:tbl>
-    <w:p>
-      <w:pPr>
-        <w:keepNext/>
-        <w:keepLines/>
-        <w:spacing w:before="240"/>
-        <w:rPr>
-          <w:b/>
-        </w:rPr>
-      </w:pPr>
-      <w:r>
-        <w:rPr>
-          <w:b/>
-        </w:rPr>
-        <w:t>Why should the game stop accepting input after the controller associated with the saved index disconnects?</w:t>
-      </w:r>
-    </w:p>
-    <w:tbl>
-      <w:tblPr>
-        <w:tblW w:w="5000" w:type="pct"/>
-        <w:tblBorders>
-          <w:top w:val="single" w:sz="4" w:space="0" w:color="BFBFBF"/>
-          <w:left w:val="single" w:sz="4" w:space="0" w:color="BFBFBF"/>
-          <w:bottom w:val="single" w:sz="4" w:space="0" w:color="BFBFBF"/>
-          <w:right w:val="single" w:sz="4" w:space="0" w:color="BFBFBF"/>
-          <w:insideH w:val="single" w:sz="4" w:space="0" w:color="BFBFBF"/>
-          <w:insideV w:val="single" w:sz="4" w:space="0" w:color="BFBFBF"/>
-        </w:tblBorders>
-        <w:tblLook w:val="04A0" w:firstRow="1" w:lastRow="0" w:firstColumn="1" w:lastColumn="0" w:noHBand="0" w:noVBand="1"/>
-      </w:tblPr>
-      <w:tblGrid>
-        <w:gridCol w:w="10800"/>
-      </w:tblGrid>
-      <w:tr>
-        <w:trPr>
-          <w:cantSplit/>
-        </w:trPr>
-        <w:tc>
-          <w:tcPr>
-            <w:tcW w:w="5000" w:type="pct"/>
-            <w:tcBorders>
-              <w:top w:val="single" w:sz="8" w:space="0" w:color="000000"/>
-              <w:left w:val="nil"/>
-              <w:bottom w:val="nil"/>
-              <w:right w:val="nil"/>
-            </w:tcBorders>
-          </w:tcPr>
-          <w:p>
-            <w:pPr>
-              <w:keepNext/>
-              <w:keepLines/>
-              <w:spacing w:after="0"/>
-              <w:rPr>
-                <w:sz w:val="16"/>
-                <w:szCs w:val="16"/>
-              </w:rPr>
-            </w:pPr>
-          </w:p>
-        </w:tc>
-      </w:tr>
-      <w:tr>
-        <w:trPr>
-          <w:cantSplit/>
-        </w:trPr>
-        <w:tc>
-          <w:tcPr>
-            <w:tcW w:w="5000" w:type="pct"/>
-            <w:tcBorders>
-              <w:top w:val="nil"/>
-              <w:left w:val="nil"/>
-              <w:bottom w:val="single" w:sz="8" w:space="0" w:color="000000"/>
-              <w:right w:val="nil"/>
-            </w:tcBorders>
-            <w:shd w:val="clear" w:color="auto" w:fill="D9D9D9" w:themeFill="background1" w:themeFillShade="D9"/>
-          </w:tcPr>
-          <w:p>
-            <w:pPr>
-              <w:keepNext/>
-              <w:keepLines/>
-              <w:spacing w:after="0"/>
-              <w:rPr>
-                <w:sz w:val="16"/>
-                <w:szCs w:val="16"/>
-              </w:rPr>
-            </w:pPr>
-          </w:p>
-        </w:tc>
-      </w:tr>
-      <w:tr>
-        <w:trPr>
-          <w:cantSplit/>
-        </w:trPr>
-        <w:tc>
-          <w:tcPr>
-            <w:tcW w:w="5000" w:type="pct"/>
-            <w:tcBorders>
-              <w:top w:val="single" w:sz="8" w:space="0" w:color="000000"/>
-              <w:left w:val="nil"/>
-              <w:bottom w:val="nil"/>
-              <w:right w:val="nil"/>
-            </w:tcBorders>
-          </w:tcPr>
-          <w:p>
-            <w:pPr>
-              <w:keepNext/>
-              <w:keepLines/>
-              <w:spacing w:after="0"/>
-              <w:rPr>
-                <w:sz w:val="16"/>
-                <w:szCs w:val="16"/>
-              </w:rPr>
-            </w:pPr>
-          </w:p>
-        </w:tc>
-      </w:tr>
-      <w:tr>
-        <w:trPr>
-          <w:cantSplit/>
-        </w:trPr>
-        <w:tc>
-          <w:tcPr>
-            <w:tcW w:w="5000" w:type="pct"/>
-            <w:tcBorders>
-              <w:top w:val="nil"/>
-              <w:left w:val="nil"/>
-              <w:bottom w:val="single" w:sz="8" w:space="0" w:color="000000"/>
-              <w:right w:val="nil"/>
-            </w:tcBorders>
-            <w:shd w:val="clear" w:color="auto" w:fill="D9D9D9" w:themeFill="background1" w:themeFillShade="D9"/>
-          </w:tcPr>
-          <w:p>
-            <w:pPr>
-              <w:keepNext/>
-              <w:keepLines/>
-              <w:spacing w:after="0"/>
-              <w:rPr>
-                <w:sz w:val="16"/>
-                <w:szCs w:val="16"/>
-              </w:rPr>
-            </w:pPr>
-          </w:p>
-        </w:tc>
-      </w:tr>
-      <w:tr>
-        <w:trPr>
-          <w:cantSplit/>
-        </w:trPr>
-        <w:tc>
-          <w:tcPr>
-            <w:tcW w:w="5000" w:type="pct"/>
-            <w:tcBorders>
-              <w:top w:val="single" w:sz="8" w:space="0" w:color="000000"/>
-              <w:left w:val="nil"/>
-              <w:bottom w:val="nil"/>
-              <w:right w:val="nil"/>
-            </w:tcBorders>
-          </w:tcPr>
-          <w:p>
-            <w:pPr>
-              <w:keepNext/>
-              <w:keepLines/>
-              <w:spacing w:after="0"/>
-              <w:rPr>
-                <w:sz w:val="16"/>
-                <w:szCs w:val="16"/>
-              </w:rPr>
-            </w:pPr>
-          </w:p>
-        </w:tc>
-      </w:tr>
-      <w:tr>
-        <w:trPr>
-          <w:cantSplit/>
-        </w:trPr>
-        <w:tc>
-          <w:tcPr>
-            <w:tcW w:w="5000" w:type="pct"/>
-            <w:tcBorders>
-              <w:top w:val="nil"/>
-              <w:left w:val="nil"/>
-              <w:bottom w:val="single" w:sz="8" w:space="0" w:color="000000"/>
-              <w:right w:val="nil"/>
-            </w:tcBorders>
-            <w:shd w:val="clear" w:color="auto" w:fill="D9D9D9" w:themeFill="background1" w:themeFillShade="D9"/>
-          </w:tcPr>
-          <w:p>
-            <w:pPr>
-              <w:keepNext/>
-              <w:keepLines/>
-              <w:spacing w:after="0"/>
-              <w:rPr>
-                <w:sz w:val="16"/>
-                <w:szCs w:val="16"/>
-              </w:rPr>
-            </w:pPr>
-          </w:p>
-        </w:tc>
-      </w:tr>
-      <w:tr>
-        <w:trPr>
-          <w:cantSplit/>
-        </w:trPr>
-        <w:tc>
-          <w:tcPr>
-            <w:tcW w:w="5000" w:type="pct"/>
-            <w:tcBorders>
-              <w:top w:val="single" w:sz="8" w:space="0" w:color="000000"/>
-              <w:left w:val="nil"/>
-              <w:bottom w:val="nil"/>
-              <w:right w:val="nil"/>
-            </w:tcBorders>
-          </w:tcPr>
-          <w:p>
-            <w:pPr>
-              <w:keepNext/>
-              <w:keepLines/>
-              <w:spacing w:after="0"/>
-              <w:rPr>
-                <w:sz w:val="16"/>
-                <w:szCs w:val="16"/>
-              </w:rPr>
-            </w:pPr>
-          </w:p>
-        </w:tc>
-      </w:tr>
-      <w:tr>
-        <w:trPr>
-          <w:cantSplit/>
-        </w:trPr>
-        <w:tc>
-          <w:tcPr>
-            <w:tcW w:w="5000" w:type="pct"/>
-            <w:tcBorders>
-              <w:top w:val="nil"/>
-              <w:left w:val="nil"/>
-              <w:bottom w:val="single" w:sz="8" w:space="0" w:color="000000"/>
-              <w:right w:val="nil"/>
-            </w:tcBorders>
-            <w:shd w:val="clear" w:color="auto" w:fill="D9D9D9" w:themeFill="background1" w:themeFillShade="D9"/>
-          </w:tcPr>
-          <w:p>
-            <w:pPr>
-              <w:keepNext w:val="0"/>
               <w:keepLines/>
               <w:spacing w:after="0"/>
               <w:rPr>
@@ -3552,7 +2026,6 @@
           </w:tcPr>
           <w:p>
             <w:pPr>
-              <w:keepNext w:val="0"/>
               <w:keepLines/>
               <w:spacing w:after="0"/>
               <w:rPr>
@@ -3805,7 +2278,6 @@
           </w:tcPr>
           <w:p>
             <w:pPr>
-              <w:keepNext w:val="0"/>
               <w:keepLines/>
               <w:spacing w:after="0"/>
               <w:rPr>
@@ -4058,7 +2530,6 @@
           </w:tcPr>
           <w:p>
             <w:pPr>
-              <w:keepNext w:val="0"/>
               <w:keepLines/>
               <w:spacing w:after="0"/>
               <w:rPr>
@@ -4083,6 +2554,7 @@
         <w:rPr>
           <w:b/>
         </w:rPr>
+        <w:lastRenderedPageBreak/>
         <w:t>How can two numeric axis values represent four joystick directions?</w:t>
       </w:r>
     </w:p>
@@ -4311,7 +2783,6 @@
           </w:tcPr>
           <w:p>
             <w:pPr>
-              <w:keepNext w:val="0"/>
               <w:keepLines/>
               <w:spacing w:after="0"/>
               <w:rPr>
@@ -4564,7 +3035,6 @@
           </w:tcPr>
           <w:p>
             <w:pPr>
-              <w:keepNext w:val="0"/>
               <w:keepLines/>
               <w:spacing w:after="0"/>
               <w:rPr>
@@ -4817,7 +3287,6 @@
           </w:tcPr>
           <w:p>
             <w:pPr>
-              <w:keepNext w:val="0"/>
               <w:keepLines/>
               <w:spacing w:after="0"/>
               <w:rPr>
@@ -5070,7 +3539,6 @@
           </w:tcPr>
           <w:p>
             <w:pPr>
-              <w:keepNext w:val="0"/>
               <w:keepLines/>
               <w:spacing w:after="0"/>
               <w:rPr>
@@ -5323,7 +3791,6 @@
           </w:tcPr>
           <w:p>
             <w:pPr>
-              <w:keepNext w:val="0"/>
               <w:keepLines/>
               <w:spacing w:after="0"/>
               <w:rPr>
@@ -5348,6 +3815,7 @@
         <w:rPr>
           <w:b/>
         </w:rPr>
+        <w:lastRenderedPageBreak/>
         <w:t>Why might the controller polling loop need to continue even after the countdown and scoring have stopped?</w:t>
       </w:r>
     </w:p>
@@ -5576,7 +4044,6 @@
           </w:tcPr>
           <w:p>
             <w:pPr>
-              <w:keepNext w:val="0"/>
               <w:keepLines/>
               <w:spacing w:after="0"/>
               <w:rPr>
@@ -5829,260 +4296,6 @@
           </w:tcPr>
           <w:p>
             <w:pPr>
-              <w:keepNext w:val="0"/>
-              <w:keepLines/>
-              <w:spacing w:after="0"/>
-              <w:rPr>
-                <w:sz w:val="16"/>
-                <w:szCs w:val="16"/>
-              </w:rPr>
-            </w:pPr>
-          </w:p>
-        </w:tc>
-      </w:tr>
-    </w:tbl>
-    <w:p>
-      <w:pPr>
-        <w:keepNext/>
-        <w:keepLines/>
-        <w:spacing w:before="240"/>
-        <w:rPr>
-          <w:b/>
-        </w:rPr>
-      </w:pPr>
-      <w:r>
-        <w:rPr>
-          <w:b/>
-        </w:rPr>
-        <w:t>What evidence shows that the countdown and direction systems operate independently but stop correctly at game over?</w:t>
-      </w:r>
-    </w:p>
-    <w:tbl>
-      <w:tblPr>
-        <w:tblW w:w="5000" w:type="pct"/>
-        <w:tblBorders>
-          <w:top w:val="single" w:sz="4" w:space="0" w:color="BFBFBF"/>
-          <w:left w:val="single" w:sz="4" w:space="0" w:color="BFBFBF"/>
-          <w:bottom w:val="single" w:sz="4" w:space="0" w:color="BFBFBF"/>
-          <w:right w:val="single" w:sz="4" w:space="0" w:color="BFBFBF"/>
-          <w:insideH w:val="single" w:sz="4" w:space="0" w:color="BFBFBF"/>
-          <w:insideV w:val="single" w:sz="4" w:space="0" w:color="BFBFBF"/>
-        </w:tblBorders>
-        <w:tblLook w:val="04A0" w:firstRow="1" w:lastRow="0" w:firstColumn="1" w:lastColumn="0" w:noHBand="0" w:noVBand="1"/>
-      </w:tblPr>
-      <w:tblGrid>
-        <w:gridCol w:w="10800"/>
-      </w:tblGrid>
-      <w:tr>
-        <w:trPr>
-          <w:cantSplit/>
-        </w:trPr>
-        <w:tc>
-          <w:tcPr>
-            <w:tcW w:w="5000" w:type="pct"/>
-            <w:tcBorders>
-              <w:top w:val="single" w:sz="8" w:space="0" w:color="000000"/>
-              <w:left w:val="nil"/>
-              <w:bottom w:val="nil"/>
-              <w:right w:val="nil"/>
-            </w:tcBorders>
-          </w:tcPr>
-          <w:p>
-            <w:pPr>
-              <w:keepNext/>
-              <w:keepLines/>
-              <w:spacing w:after="0"/>
-              <w:rPr>
-                <w:sz w:val="16"/>
-                <w:szCs w:val="16"/>
-              </w:rPr>
-            </w:pPr>
-          </w:p>
-        </w:tc>
-      </w:tr>
-      <w:tr>
-        <w:trPr>
-          <w:cantSplit/>
-        </w:trPr>
-        <w:tc>
-          <w:tcPr>
-            <w:tcW w:w="5000" w:type="pct"/>
-            <w:tcBorders>
-              <w:top w:val="nil"/>
-              <w:left w:val="nil"/>
-              <w:bottom w:val="single" w:sz="8" w:space="0" w:color="000000"/>
-              <w:right w:val="nil"/>
-            </w:tcBorders>
-            <w:shd w:val="clear" w:color="auto" w:fill="D9D9D9" w:themeFill="background1" w:themeFillShade="D9"/>
-          </w:tcPr>
-          <w:p>
-            <w:pPr>
-              <w:keepNext/>
-              <w:keepLines/>
-              <w:spacing w:after="0"/>
-              <w:rPr>
-                <w:sz w:val="16"/>
-                <w:szCs w:val="16"/>
-              </w:rPr>
-            </w:pPr>
-          </w:p>
-        </w:tc>
-      </w:tr>
-      <w:tr>
-        <w:trPr>
-          <w:cantSplit/>
-        </w:trPr>
-        <w:tc>
-          <w:tcPr>
-            <w:tcW w:w="5000" w:type="pct"/>
-            <w:tcBorders>
-              <w:top w:val="single" w:sz="8" w:space="0" w:color="000000"/>
-              <w:left w:val="nil"/>
-              <w:bottom w:val="nil"/>
-              <w:right w:val="nil"/>
-            </w:tcBorders>
-          </w:tcPr>
-          <w:p>
-            <w:pPr>
-              <w:keepNext/>
-              <w:keepLines/>
-              <w:spacing w:after="0"/>
-              <w:rPr>
-                <w:sz w:val="16"/>
-                <w:szCs w:val="16"/>
-              </w:rPr>
-            </w:pPr>
-          </w:p>
-        </w:tc>
-      </w:tr>
-      <w:tr>
-        <w:trPr>
-          <w:cantSplit/>
-        </w:trPr>
-        <w:tc>
-          <w:tcPr>
-            <w:tcW w:w="5000" w:type="pct"/>
-            <w:tcBorders>
-              <w:top w:val="nil"/>
-              <w:left w:val="nil"/>
-              <w:bottom w:val="single" w:sz="8" w:space="0" w:color="000000"/>
-              <w:right w:val="nil"/>
-            </w:tcBorders>
-            <w:shd w:val="clear" w:color="auto" w:fill="D9D9D9" w:themeFill="background1" w:themeFillShade="D9"/>
-          </w:tcPr>
-          <w:p>
-            <w:pPr>
-              <w:keepNext/>
-              <w:keepLines/>
-              <w:spacing w:after="0"/>
-              <w:rPr>
-                <w:sz w:val="16"/>
-                <w:szCs w:val="16"/>
-              </w:rPr>
-            </w:pPr>
-          </w:p>
-        </w:tc>
-      </w:tr>
-      <w:tr>
-        <w:trPr>
-          <w:cantSplit/>
-        </w:trPr>
-        <w:tc>
-          <w:tcPr>
-            <w:tcW w:w="5000" w:type="pct"/>
-            <w:tcBorders>
-              <w:top w:val="single" w:sz="8" w:space="0" w:color="000000"/>
-              <w:left w:val="nil"/>
-              <w:bottom w:val="nil"/>
-              <w:right w:val="nil"/>
-            </w:tcBorders>
-          </w:tcPr>
-          <w:p>
-            <w:pPr>
-              <w:keepNext/>
-              <w:keepLines/>
-              <w:spacing w:after="0"/>
-              <w:rPr>
-                <w:sz w:val="16"/>
-                <w:szCs w:val="16"/>
-              </w:rPr>
-            </w:pPr>
-          </w:p>
-        </w:tc>
-      </w:tr>
-      <w:tr>
-        <w:trPr>
-          <w:cantSplit/>
-        </w:trPr>
-        <w:tc>
-          <w:tcPr>
-            <w:tcW w:w="5000" w:type="pct"/>
-            <w:tcBorders>
-              <w:top w:val="nil"/>
-              <w:left w:val="nil"/>
-              <w:bottom w:val="single" w:sz="8" w:space="0" w:color="000000"/>
-              <w:right w:val="nil"/>
-            </w:tcBorders>
-            <w:shd w:val="clear" w:color="auto" w:fill="D9D9D9" w:themeFill="background1" w:themeFillShade="D9"/>
-          </w:tcPr>
-          <w:p>
-            <w:pPr>
-              <w:keepNext/>
-              <w:keepLines/>
-              <w:spacing w:after="0"/>
-              <w:rPr>
-                <w:sz w:val="16"/>
-                <w:szCs w:val="16"/>
-              </w:rPr>
-            </w:pPr>
-          </w:p>
-        </w:tc>
-      </w:tr>
-      <w:tr>
-        <w:trPr>
-          <w:cantSplit/>
-        </w:trPr>
-        <w:tc>
-          <w:tcPr>
-            <w:tcW w:w="5000" w:type="pct"/>
-            <w:tcBorders>
-              <w:top w:val="single" w:sz="8" w:space="0" w:color="000000"/>
-              <w:left w:val="nil"/>
-              <w:bottom w:val="nil"/>
-              <w:right w:val="nil"/>
-            </w:tcBorders>
-          </w:tcPr>
-          <w:p>
-            <w:pPr>
-              <w:keepNext/>
-              <w:keepLines/>
-              <w:spacing w:after="0"/>
-              <w:rPr>
-                <w:sz w:val="16"/>
-                <w:szCs w:val="16"/>
-              </w:rPr>
-            </w:pPr>
-          </w:p>
-        </w:tc>
-      </w:tr>
-      <w:tr>
-        <w:trPr>
-          <w:cantSplit/>
-        </w:trPr>
-        <w:tc>
-          <w:tcPr>
-            <w:tcW w:w="5000" w:type="pct"/>
-            <w:tcBorders>
-              <w:top w:val="nil"/>
-              <w:left w:val="nil"/>
-              <w:bottom w:val="single" w:sz="8" w:space="0" w:color="000000"/>
-              <w:right w:val="nil"/>
-            </w:tcBorders>
-            <w:shd w:val="clear" w:color="auto" w:fill="D9D9D9" w:themeFill="background1" w:themeFillShade="D9"/>
-          </w:tcPr>
-          <w:p>
-            <w:pPr>
-              <w:keepNext w:val="0"/>
               <w:keepLines/>
               <w:spacing w:after="0"/>
               <w:rPr>
@@ -6335,7 +4548,6 @@
           </w:tcPr>
           <w:p>
             <w:pPr>
-              <w:keepNext w:val="0"/>
               <w:keepLines/>
               <w:spacing w:after="0"/>
               <w:rPr>
@@ -6588,513 +4800,6 @@
           </w:tcPr>
           <w:p>
             <w:pPr>
-              <w:keepNext w:val="0"/>
-              <w:keepLines/>
-              <w:spacing w:after="0"/>
-              <w:rPr>
-                <w:sz w:val="16"/>
-                <w:szCs w:val="16"/>
-              </w:rPr>
-            </w:pPr>
-          </w:p>
-        </w:tc>
-      </w:tr>
-    </w:tbl>
-    <w:p>
-      <w:pPr>
-        <w:keepNext/>
-        <w:keepLines/>
-        <w:spacing w:before="240"/>
-        <w:rPr>
-          <w:b/>
-        </w:rPr>
-      </w:pPr>
-      <w:r>
-        <w:rPr>
-          <w:b/>
-        </w:rPr>
-        <w:t>Which failure condition revealed the most important weakness in your first implementation, and how did you correct it?</w:t>
-      </w:r>
-    </w:p>
-    <w:tbl>
-      <w:tblPr>
-        <w:tblW w:w="5000" w:type="pct"/>
-        <w:tblBorders>
-          <w:top w:val="single" w:sz="4" w:space="0" w:color="BFBFBF"/>
-          <w:left w:val="single" w:sz="4" w:space="0" w:color="BFBFBF"/>
-          <w:bottom w:val="single" w:sz="4" w:space="0" w:color="BFBFBF"/>
-          <w:right w:val="single" w:sz="4" w:space="0" w:color="BFBFBF"/>
-          <w:insideH w:val="single" w:sz="4" w:space="0" w:color="BFBFBF"/>
-          <w:insideV w:val="single" w:sz="4" w:space="0" w:color="BFBFBF"/>
-        </w:tblBorders>
-        <w:tblLook w:val="04A0" w:firstRow="1" w:lastRow="0" w:firstColumn="1" w:lastColumn="0" w:noHBand="0" w:noVBand="1"/>
-      </w:tblPr>
-      <w:tblGrid>
-        <w:gridCol w:w="10800"/>
-      </w:tblGrid>
-      <w:tr>
-        <w:trPr>
-          <w:cantSplit/>
-        </w:trPr>
-        <w:tc>
-          <w:tcPr>
-            <w:tcW w:w="5000" w:type="pct"/>
-            <w:tcBorders>
-              <w:top w:val="single" w:sz="8" w:space="0" w:color="000000"/>
-              <w:left w:val="nil"/>
-              <w:bottom w:val="nil"/>
-              <w:right w:val="nil"/>
-            </w:tcBorders>
-          </w:tcPr>
-          <w:p>
-            <w:pPr>
-              <w:keepNext/>
-              <w:keepLines/>
-              <w:spacing w:after="0"/>
-              <w:rPr>
-                <w:sz w:val="16"/>
-                <w:szCs w:val="16"/>
-              </w:rPr>
-            </w:pPr>
-          </w:p>
-        </w:tc>
-      </w:tr>
-      <w:tr>
-        <w:trPr>
-          <w:cantSplit/>
-        </w:trPr>
-        <w:tc>
-          <w:tcPr>
-            <w:tcW w:w="5000" w:type="pct"/>
-            <w:tcBorders>
-              <w:top w:val="nil"/>
-              <w:left w:val="nil"/>
-              <w:bottom w:val="single" w:sz="8" w:space="0" w:color="000000"/>
-              <w:right w:val="nil"/>
-            </w:tcBorders>
-            <w:shd w:val="clear" w:color="auto" w:fill="D9D9D9" w:themeFill="background1" w:themeFillShade="D9"/>
-          </w:tcPr>
-          <w:p>
-            <w:pPr>
-              <w:keepNext/>
-              <w:keepLines/>
-              <w:spacing w:after="0"/>
-              <w:rPr>
-                <w:sz w:val="16"/>
-                <w:szCs w:val="16"/>
-              </w:rPr>
-            </w:pPr>
-          </w:p>
-        </w:tc>
-      </w:tr>
-      <w:tr>
-        <w:trPr>
-          <w:cantSplit/>
-        </w:trPr>
-        <w:tc>
-          <w:tcPr>
-            <w:tcW w:w="5000" w:type="pct"/>
-            <w:tcBorders>
-              <w:top w:val="single" w:sz="8" w:space="0" w:color="000000"/>
-              <w:left w:val="nil"/>
-              <w:bottom w:val="nil"/>
-              <w:right w:val="nil"/>
-            </w:tcBorders>
-          </w:tcPr>
-          <w:p>
-            <w:pPr>
-              <w:keepNext/>
-              <w:keepLines/>
-              <w:spacing w:after="0"/>
-              <w:rPr>
-                <w:sz w:val="16"/>
-                <w:szCs w:val="16"/>
-              </w:rPr>
-            </w:pPr>
-          </w:p>
-        </w:tc>
-      </w:tr>
-      <w:tr>
-        <w:trPr>
-          <w:cantSplit/>
-        </w:trPr>
-        <w:tc>
-          <w:tcPr>
-            <w:tcW w:w="5000" w:type="pct"/>
-            <w:tcBorders>
-              <w:top w:val="nil"/>
-              <w:left w:val="nil"/>
-              <w:bottom w:val="single" w:sz="8" w:space="0" w:color="000000"/>
-              <w:right w:val="nil"/>
-            </w:tcBorders>
-            <w:shd w:val="clear" w:color="auto" w:fill="D9D9D9" w:themeFill="background1" w:themeFillShade="D9"/>
-          </w:tcPr>
-          <w:p>
-            <w:pPr>
-              <w:keepNext/>
-              <w:keepLines/>
-              <w:spacing w:after="0"/>
-              <w:rPr>
-                <w:sz w:val="16"/>
-                <w:szCs w:val="16"/>
-              </w:rPr>
-            </w:pPr>
-          </w:p>
-        </w:tc>
-      </w:tr>
-      <w:tr>
-        <w:trPr>
-          <w:cantSplit/>
-        </w:trPr>
-        <w:tc>
-          <w:tcPr>
-            <w:tcW w:w="5000" w:type="pct"/>
-            <w:tcBorders>
-              <w:top w:val="single" w:sz="8" w:space="0" w:color="000000"/>
-              <w:left w:val="nil"/>
-              <w:bottom w:val="nil"/>
-              <w:right w:val="nil"/>
-            </w:tcBorders>
-          </w:tcPr>
-          <w:p>
-            <w:pPr>
-              <w:keepNext/>
-              <w:keepLines/>
-              <w:spacing w:after="0"/>
-              <w:rPr>
-                <w:sz w:val="16"/>
-                <w:szCs w:val="16"/>
-              </w:rPr>
-            </w:pPr>
-          </w:p>
-        </w:tc>
-      </w:tr>
-      <w:tr>
-        <w:trPr>
-          <w:cantSplit/>
-        </w:trPr>
-        <w:tc>
-          <w:tcPr>
-            <w:tcW w:w="5000" w:type="pct"/>
-            <w:tcBorders>
-              <w:top w:val="nil"/>
-              <w:left w:val="nil"/>
-              <w:bottom w:val="single" w:sz="8" w:space="0" w:color="000000"/>
-              <w:right w:val="nil"/>
-            </w:tcBorders>
-            <w:shd w:val="clear" w:color="auto" w:fill="D9D9D9" w:themeFill="background1" w:themeFillShade="D9"/>
-          </w:tcPr>
-          <w:p>
-            <w:pPr>
-              <w:keepNext/>
-              <w:keepLines/>
-              <w:spacing w:after="0"/>
-              <w:rPr>
-                <w:sz w:val="16"/>
-                <w:szCs w:val="16"/>
-              </w:rPr>
-            </w:pPr>
-          </w:p>
-        </w:tc>
-      </w:tr>
-      <w:tr>
-        <w:trPr>
-          <w:cantSplit/>
-        </w:trPr>
-        <w:tc>
-          <w:tcPr>
-            <w:tcW w:w="5000" w:type="pct"/>
-            <w:tcBorders>
-              <w:top w:val="single" w:sz="8" w:space="0" w:color="000000"/>
-              <w:left w:val="nil"/>
-              <w:bottom w:val="nil"/>
-              <w:right w:val="nil"/>
-            </w:tcBorders>
-          </w:tcPr>
-          <w:p>
-            <w:pPr>
-              <w:keepNext/>
-              <w:keepLines/>
-              <w:spacing w:after="0"/>
-              <w:rPr>
-                <w:sz w:val="16"/>
-                <w:szCs w:val="16"/>
-              </w:rPr>
-            </w:pPr>
-          </w:p>
-        </w:tc>
-      </w:tr>
-      <w:tr>
-        <w:trPr>
-          <w:cantSplit/>
-        </w:trPr>
-        <w:tc>
-          <w:tcPr>
-            <w:tcW w:w="5000" w:type="pct"/>
-            <w:tcBorders>
-              <w:top w:val="nil"/>
-              <w:left w:val="nil"/>
-              <w:bottom w:val="single" w:sz="8" w:space="0" w:color="000000"/>
-              <w:right w:val="nil"/>
-            </w:tcBorders>
-            <w:shd w:val="clear" w:color="auto" w:fill="D9D9D9" w:themeFill="background1" w:themeFillShade="D9"/>
-          </w:tcPr>
-          <w:p>
-            <w:pPr>
-              <w:keepNext w:val="0"/>
-              <w:keepLines/>
-              <w:spacing w:after="0"/>
-              <w:rPr>
-                <w:sz w:val="16"/>
-                <w:szCs w:val="16"/>
-              </w:rPr>
-            </w:pPr>
-          </w:p>
-        </w:tc>
-      </w:tr>
-    </w:tbl>
-    <w:p>
-      <w:pPr>
-        <w:keepNext/>
-        <w:keepLines/>
-        <w:spacing w:before="240"/>
-        <w:rPr>
-          <w:b/>
-        </w:rPr>
-      </w:pPr>
-      <w:r>
-        <w:rPr>
-          <w:b/>
-        </w:rPr>
-        <w:t>How do timed callbacks, controller polling, stored state, conditional logic, and DOM updates cooperate to create the game?</w:t>
-      </w:r>
-    </w:p>
-    <w:tbl>
-      <w:tblPr>
-        <w:tblW w:w="5000" w:type="pct"/>
-        <w:tblBorders>
-          <w:top w:val="single" w:sz="4" w:space="0" w:color="BFBFBF"/>
-          <w:left w:val="single" w:sz="4" w:space="0" w:color="BFBFBF"/>
-          <w:bottom w:val="single" w:sz="4" w:space="0" w:color="BFBFBF"/>
-          <w:right w:val="single" w:sz="4" w:space="0" w:color="BFBFBF"/>
-          <w:insideH w:val="single" w:sz="4" w:space="0" w:color="BFBFBF"/>
-          <w:insideV w:val="single" w:sz="4" w:space="0" w:color="BFBFBF"/>
-        </w:tblBorders>
-        <w:tblLook w:val="04A0" w:firstRow="1" w:lastRow="0" w:firstColumn="1" w:lastColumn="0" w:noHBand="0" w:noVBand="1"/>
-      </w:tblPr>
-      <w:tblGrid>
-        <w:gridCol w:w="10800"/>
-      </w:tblGrid>
-      <w:tr>
-        <w:trPr>
-          <w:cantSplit/>
-        </w:trPr>
-        <w:tc>
-          <w:tcPr>
-            <w:tcW w:w="5000" w:type="pct"/>
-            <w:tcBorders>
-              <w:top w:val="single" w:sz="8" w:space="0" w:color="000000"/>
-              <w:left w:val="nil"/>
-              <w:bottom w:val="nil"/>
-              <w:right w:val="nil"/>
-            </w:tcBorders>
-          </w:tcPr>
-          <w:p>
-            <w:pPr>
-              <w:keepNext/>
-              <w:keepLines/>
-              <w:spacing w:after="0"/>
-              <w:rPr>
-                <w:sz w:val="16"/>
-                <w:szCs w:val="16"/>
-              </w:rPr>
-            </w:pPr>
-          </w:p>
-        </w:tc>
-      </w:tr>
-      <w:tr>
-        <w:trPr>
-          <w:cantSplit/>
-        </w:trPr>
-        <w:tc>
-          <w:tcPr>
-            <w:tcW w:w="5000" w:type="pct"/>
-            <w:tcBorders>
-              <w:top w:val="nil"/>
-              <w:left w:val="nil"/>
-              <w:bottom w:val="single" w:sz="8" w:space="0" w:color="000000"/>
-              <w:right w:val="nil"/>
-            </w:tcBorders>
-            <w:shd w:val="clear" w:color="auto" w:fill="D9D9D9" w:themeFill="background1" w:themeFillShade="D9"/>
-          </w:tcPr>
-          <w:p>
-            <w:pPr>
-              <w:keepNext/>
-              <w:keepLines/>
-              <w:spacing w:after="0"/>
-              <w:rPr>
-                <w:sz w:val="16"/>
-                <w:szCs w:val="16"/>
-              </w:rPr>
-            </w:pPr>
-          </w:p>
-        </w:tc>
-      </w:tr>
-      <w:tr>
-        <w:trPr>
-          <w:cantSplit/>
-        </w:trPr>
-        <w:tc>
-          <w:tcPr>
-            <w:tcW w:w="5000" w:type="pct"/>
-            <w:tcBorders>
-              <w:top w:val="single" w:sz="8" w:space="0" w:color="000000"/>
-              <w:left w:val="nil"/>
-              <w:bottom w:val="nil"/>
-              <w:right w:val="nil"/>
-            </w:tcBorders>
-          </w:tcPr>
-          <w:p>
-            <w:pPr>
-              <w:keepNext/>
-              <w:keepLines/>
-              <w:spacing w:after="0"/>
-              <w:rPr>
-                <w:sz w:val="16"/>
-                <w:szCs w:val="16"/>
-              </w:rPr>
-            </w:pPr>
-          </w:p>
-        </w:tc>
-      </w:tr>
-      <w:tr>
-        <w:trPr>
-          <w:cantSplit/>
-        </w:trPr>
-        <w:tc>
-          <w:tcPr>
-            <w:tcW w:w="5000" w:type="pct"/>
-            <w:tcBorders>
-              <w:top w:val="nil"/>
-              <w:left w:val="nil"/>
-              <w:bottom w:val="single" w:sz="8" w:space="0" w:color="000000"/>
-              <w:right w:val="nil"/>
-            </w:tcBorders>
-            <w:shd w:val="clear" w:color="auto" w:fill="D9D9D9" w:themeFill="background1" w:themeFillShade="D9"/>
-          </w:tcPr>
-          <w:p>
-            <w:pPr>
-              <w:keepNext/>
-              <w:keepLines/>
-              <w:spacing w:after="0"/>
-              <w:rPr>
-                <w:sz w:val="16"/>
-                <w:szCs w:val="16"/>
-              </w:rPr>
-            </w:pPr>
-          </w:p>
-        </w:tc>
-      </w:tr>
-      <w:tr>
-        <w:trPr>
-          <w:cantSplit/>
-        </w:trPr>
-        <w:tc>
-          <w:tcPr>
-            <w:tcW w:w="5000" w:type="pct"/>
-            <w:tcBorders>
-              <w:top w:val="single" w:sz="8" w:space="0" w:color="000000"/>
-              <w:left w:val="nil"/>
-              <w:bottom w:val="nil"/>
-              <w:right w:val="nil"/>
-            </w:tcBorders>
-          </w:tcPr>
-          <w:p>
-            <w:pPr>
-              <w:keepNext/>
-              <w:keepLines/>
-              <w:spacing w:after="0"/>
-              <w:rPr>
-                <w:sz w:val="16"/>
-                <w:szCs w:val="16"/>
-              </w:rPr>
-            </w:pPr>
-          </w:p>
-        </w:tc>
-      </w:tr>
-      <w:tr>
-        <w:trPr>
-          <w:cantSplit/>
-        </w:trPr>
-        <w:tc>
-          <w:tcPr>
-            <w:tcW w:w="5000" w:type="pct"/>
-            <w:tcBorders>
-              <w:top w:val="nil"/>
-              <w:left w:val="nil"/>
-              <w:bottom w:val="single" w:sz="8" w:space="0" w:color="000000"/>
-              <w:right w:val="nil"/>
-            </w:tcBorders>
-            <w:shd w:val="clear" w:color="auto" w:fill="D9D9D9" w:themeFill="background1" w:themeFillShade="D9"/>
-          </w:tcPr>
-          <w:p>
-            <w:pPr>
-              <w:keepNext/>
-              <w:keepLines/>
-              <w:spacing w:after="0"/>
-              <w:rPr>
-                <w:sz w:val="16"/>
-                <w:szCs w:val="16"/>
-              </w:rPr>
-            </w:pPr>
-          </w:p>
-        </w:tc>
-      </w:tr>
-      <w:tr>
-        <w:trPr>
-          <w:cantSplit/>
-        </w:trPr>
-        <w:tc>
-          <w:tcPr>
-            <w:tcW w:w="5000" w:type="pct"/>
-            <w:tcBorders>
-              <w:top w:val="single" w:sz="8" w:space="0" w:color="000000"/>
-              <w:left w:val="nil"/>
-              <w:bottom w:val="nil"/>
-              <w:right w:val="nil"/>
-            </w:tcBorders>
-          </w:tcPr>
-          <w:p>
-            <w:pPr>
-              <w:keepNext/>
-              <w:keepLines/>
-              <w:spacing w:after="0"/>
-              <w:rPr>
-                <w:sz w:val="16"/>
-                <w:szCs w:val="16"/>
-              </w:rPr>
-            </w:pPr>
-          </w:p>
-        </w:tc>
-      </w:tr>
-      <w:tr>
-        <w:trPr>
-          <w:cantSplit/>
-        </w:trPr>
-        <w:tc>
-          <w:tcPr>
-            <w:tcW w:w="5000" w:type="pct"/>
-            <w:tcBorders>
-              <w:top w:val="nil"/>
-              <w:left w:val="nil"/>
-              <w:bottom w:val="single" w:sz="8" w:space="0" w:color="000000"/>
-              <w:right w:val="nil"/>
-            </w:tcBorders>
-            <w:shd w:val="clear" w:color="auto" w:fill="D9D9D9" w:themeFill="background1" w:themeFillShade="D9"/>
-          </w:tcPr>
-          <w:p>
-            <w:pPr>
-              <w:keepNext w:val="0"/>
               <w:keepLines/>
               <w:spacing w:after="0"/>
               <w:rPr>
@@ -7109,10 +4814,27 @@
     <w:p>
       <w:pPr>
         <w:pStyle w:val="Heading1"/>
-        <w:keepNext/>
-        <w:keepLines/>
+      </w:pPr>
+    </w:p>
+    <w:p>
+      <w:pPr>
+        <w:rPr>
+          <w:rFonts w:asciiTheme="majorHAnsi" w:eastAsiaTheme="majorEastAsia" w:hAnsiTheme="majorHAnsi" w:cstheme="majorBidi"/>
+          <w:color w:val="2F5496" w:themeColor="accent1" w:themeShade="BF"/>
+          <w:sz w:val="32"/>
+          <w:szCs w:val="32"/>
+        </w:rPr>
       </w:pPr>
       <w:r>
+        <w:br w:type="page"/>
+      </w:r>
+    </w:p>
+    <w:p>
+      <w:pPr>
+        <w:pStyle w:val="Heading1"/>
+      </w:pPr>
+      <w:r>
+        <w:lastRenderedPageBreak/>
         <w:t>End-of-Lesson Reflections</w:t>
       </w:r>
     </w:p>
@@ -7357,7 +5079,6 @@
           </w:tcPr>
           <w:p>
             <w:pPr>
-              <w:keepNext w:val="0"/>
               <w:keepLines/>
               <w:spacing w:after="0"/>
               <w:rPr>
@@ -7610,7 +5331,6 @@
           </w:tcPr>
           <w:p>
             <w:pPr>
-              <w:keepNext w:val="0"/>
               <w:keepLines/>
               <w:spacing w:after="0"/>
               <w:rPr>
@@ -7863,7 +5583,6 @@
           </w:tcPr>
           <w:p>
             <w:pPr>
-              <w:keepNext w:val="0"/>
               <w:keepLines/>
               <w:spacing w:after="0"/>
               <w:rPr>
@@ -7875,6 +5594,7 @@
         </w:tc>
       </w:tr>
     </w:tbl>
+    <w:p/>
     <w:sectPr>
       <w:pgSz w:w="12240" w:h="15840"/>
       <w:pgMar w:top="720" w:right="720" w:bottom="720" w:left="720" w:header="720" w:footer="720" w:gutter="0"/>

</xml_diff>